<commit_message>
docs(báo cáo): làm rõ yêu cầu 10 quy trình và sửa mục kế hoạch làm việc
</commit_message>
<xml_diff>
--- a/01_LaVanTien/baocao.docx
+++ b/01_LaVanTien/baocao.docx
@@ -3420,7 +3420,7 @@
           <w:rFonts w:ascii="Times New Roman" w:hAnsi="Times New Roman" w:cs="Times New Roman"/>
           <w:sz w:val="26"/>
         </w:rPr>
-        <w:t>Các quy trình nghiệp vụ của Highlands Coffee được phân thành ba lớp: quy trình quản lý (Management), quy trình cốt lõi (Core) và quy trình hỗ trợ (Support). Tổng cộng cần liệt kê tối thiểu 10 quy trình.</w:t>
+        <w:t>Các quy trình nghiệp vụ của Highlands Coffee được phân thành ba lớp: quy trình quản lý (Management), quy trình cốt lõi (Core) và quy trình hỗ trợ (Support). Cần liệt kê tối thiểu 10 quy trình: mỗi lớp từ 3 quy trình trở lên (3+3+3 = 9), nên một lớp phải có ít nhất 4 quy trình để đạt mốc 10. Mỗi quy trình phải nêu đủ 4 thông tin: Tác nhân (Actor), mô tả các bước bằng lời, đối tượng khách hàng, các khả năng kết quả.</w:t>
       </w:r>
     </w:p>
     <w:p>
@@ -3443,7 +3443,7 @@
           <w:color w:val="808080"/>
           <w:sz w:val="24"/>
         </w:rPr>
-        <w:t>[Phụ trách: Lê Thị Mỹ Dung - Phần 1] Liệt kê ít nhất 3 quy trình quản lý. Với mỗi quy trình nêu: Tác nhân (Actor), mô tả các bước, đối tượng khách hàng và các khả năng kết quả.</w:t>
+        <w:t>[Phụ trách: Lê Thị Mỹ Dung - Phần 1] Liệt kê ít nhất 3 quy trình quản lý vào Bảng 1.2. Mỗi quy trình nêu đủ 4 thông tin: Tác nhân (Actor), mô tả các bước, đối tượng khách hàng, các khả năng kết quả.</w:t>
       </w:r>
     </w:p>
     <w:p>
@@ -3695,6 +3695,285 @@
           </w:p>
         </w:tc>
       </w:tr>
+      <w:tr>
+        <w:tc>
+          <w:tcPr>
+            <w:tcW w:type="dxa" w:w="1464"/>
+          </w:tcPr>
+          <w:p>
+            <w:r/>
+            <w:r>
+              <w:rPr>
+                <w:rFonts w:ascii="Times New Roman" w:hAnsi="Times New Roman" w:cs="Times New Roman"/>
+                <w:b w:val="0"/>
+                <w:sz w:val="24"/>
+              </w:rPr>
+              <w:t>2</w:t>
+            </w:r>
+          </w:p>
+        </w:tc>
+        <w:tc>
+          <w:tcPr>
+            <w:tcW w:type="dxa" w:w="1464"/>
+          </w:tcPr>
+          <w:p>
+            <w:r/>
+            <w:r>
+              <w:rPr>
+                <w:rFonts w:ascii="Times New Roman" w:hAnsi="Times New Roman" w:cs="Times New Roman"/>
+                <w:b w:val="0"/>
+                <w:sz w:val="24"/>
+              </w:rPr>
+            </w:r>
+          </w:p>
+        </w:tc>
+        <w:tc>
+          <w:tcPr>
+            <w:tcW w:type="dxa" w:w="1464"/>
+          </w:tcPr>
+          <w:p>
+            <w:r/>
+            <w:r>
+              <w:rPr>
+                <w:rFonts w:ascii="Times New Roman" w:hAnsi="Times New Roman" w:cs="Times New Roman"/>
+                <w:b w:val="0"/>
+                <w:sz w:val="24"/>
+              </w:rPr>
+            </w:r>
+          </w:p>
+        </w:tc>
+        <w:tc>
+          <w:tcPr>
+            <w:tcW w:type="dxa" w:w="1464"/>
+          </w:tcPr>
+          <w:p>
+            <w:r/>
+            <w:r>
+              <w:rPr>
+                <w:rFonts w:ascii="Times New Roman" w:hAnsi="Times New Roman" w:cs="Times New Roman"/>
+                <w:b w:val="0"/>
+                <w:sz w:val="24"/>
+              </w:rPr>
+            </w:r>
+          </w:p>
+        </w:tc>
+        <w:tc>
+          <w:tcPr>
+            <w:tcW w:type="dxa" w:w="1464"/>
+          </w:tcPr>
+          <w:p>
+            <w:r/>
+            <w:r>
+              <w:rPr>
+                <w:rFonts w:ascii="Times New Roman" w:hAnsi="Times New Roman" w:cs="Times New Roman"/>
+                <w:b w:val="0"/>
+                <w:sz w:val="24"/>
+              </w:rPr>
+            </w:r>
+          </w:p>
+        </w:tc>
+        <w:tc>
+          <w:tcPr>
+            <w:tcW w:type="dxa" w:w="1464"/>
+          </w:tcPr>
+          <w:p>
+            <w:r/>
+            <w:r>
+              <w:rPr>
+                <w:rFonts w:ascii="Times New Roman" w:hAnsi="Times New Roman" w:cs="Times New Roman"/>
+                <w:b w:val="0"/>
+                <w:sz w:val="24"/>
+              </w:rPr>
+            </w:r>
+          </w:p>
+        </w:tc>
+      </w:tr>
+      <w:tr>
+        <w:tc>
+          <w:tcPr>
+            <w:tcW w:type="dxa" w:w="1464"/>
+          </w:tcPr>
+          <w:p>
+            <w:r/>
+            <w:r>
+              <w:rPr>
+                <w:rFonts w:ascii="Times New Roman" w:hAnsi="Times New Roman" w:cs="Times New Roman"/>
+                <w:b w:val="0"/>
+                <w:sz w:val="24"/>
+              </w:rPr>
+              <w:t>3</w:t>
+            </w:r>
+          </w:p>
+        </w:tc>
+        <w:tc>
+          <w:tcPr>
+            <w:tcW w:type="dxa" w:w="1464"/>
+          </w:tcPr>
+          <w:p>
+            <w:r/>
+            <w:r>
+              <w:rPr>
+                <w:rFonts w:ascii="Times New Roman" w:hAnsi="Times New Roman" w:cs="Times New Roman"/>
+                <w:b w:val="0"/>
+                <w:sz w:val="24"/>
+              </w:rPr>
+            </w:r>
+          </w:p>
+        </w:tc>
+        <w:tc>
+          <w:tcPr>
+            <w:tcW w:type="dxa" w:w="1464"/>
+          </w:tcPr>
+          <w:p>
+            <w:r/>
+            <w:r>
+              <w:rPr>
+                <w:rFonts w:ascii="Times New Roman" w:hAnsi="Times New Roman" w:cs="Times New Roman"/>
+                <w:b w:val="0"/>
+                <w:sz w:val="24"/>
+              </w:rPr>
+            </w:r>
+          </w:p>
+        </w:tc>
+        <w:tc>
+          <w:tcPr>
+            <w:tcW w:type="dxa" w:w="1464"/>
+          </w:tcPr>
+          <w:p>
+            <w:r/>
+            <w:r>
+              <w:rPr>
+                <w:rFonts w:ascii="Times New Roman" w:hAnsi="Times New Roman" w:cs="Times New Roman"/>
+                <w:b w:val="0"/>
+                <w:sz w:val="24"/>
+              </w:rPr>
+            </w:r>
+          </w:p>
+        </w:tc>
+        <w:tc>
+          <w:tcPr>
+            <w:tcW w:type="dxa" w:w="1464"/>
+          </w:tcPr>
+          <w:p>
+            <w:r/>
+            <w:r>
+              <w:rPr>
+                <w:rFonts w:ascii="Times New Roman" w:hAnsi="Times New Roman" w:cs="Times New Roman"/>
+                <w:b w:val="0"/>
+                <w:sz w:val="24"/>
+              </w:rPr>
+            </w:r>
+          </w:p>
+        </w:tc>
+        <w:tc>
+          <w:tcPr>
+            <w:tcW w:type="dxa" w:w="1464"/>
+          </w:tcPr>
+          <w:p>
+            <w:r/>
+            <w:r>
+              <w:rPr>
+                <w:rFonts w:ascii="Times New Roman" w:hAnsi="Times New Roman" w:cs="Times New Roman"/>
+                <w:b w:val="0"/>
+                <w:sz w:val="24"/>
+              </w:rPr>
+            </w:r>
+          </w:p>
+        </w:tc>
+      </w:tr>
+      <w:tr>
+        <w:tc>
+          <w:tcPr>
+            <w:tcW w:type="dxa" w:w="1464"/>
+          </w:tcPr>
+          <w:p>
+            <w:r/>
+            <w:r>
+              <w:rPr>
+                <w:rFonts w:ascii="Times New Roman" w:hAnsi="Times New Roman" w:cs="Times New Roman"/>
+                <w:b w:val="0"/>
+                <w:sz w:val="24"/>
+              </w:rPr>
+              <w:t>4</w:t>
+            </w:r>
+          </w:p>
+        </w:tc>
+        <w:tc>
+          <w:tcPr>
+            <w:tcW w:type="dxa" w:w="1464"/>
+          </w:tcPr>
+          <w:p>
+            <w:r/>
+            <w:r>
+              <w:rPr>
+                <w:rFonts w:ascii="Times New Roman" w:hAnsi="Times New Roman" w:cs="Times New Roman"/>
+                <w:b w:val="0"/>
+                <w:sz w:val="24"/>
+              </w:rPr>
+            </w:r>
+          </w:p>
+        </w:tc>
+        <w:tc>
+          <w:tcPr>
+            <w:tcW w:type="dxa" w:w="1464"/>
+          </w:tcPr>
+          <w:p>
+            <w:r/>
+            <w:r>
+              <w:rPr>
+                <w:rFonts w:ascii="Times New Roman" w:hAnsi="Times New Roman" w:cs="Times New Roman"/>
+                <w:b w:val="0"/>
+                <w:sz w:val="24"/>
+              </w:rPr>
+            </w:r>
+          </w:p>
+        </w:tc>
+        <w:tc>
+          <w:tcPr>
+            <w:tcW w:type="dxa" w:w="1464"/>
+          </w:tcPr>
+          <w:p>
+            <w:r/>
+            <w:r>
+              <w:rPr>
+                <w:rFonts w:ascii="Times New Roman" w:hAnsi="Times New Roman" w:cs="Times New Roman"/>
+                <w:b w:val="0"/>
+                <w:sz w:val="24"/>
+              </w:rPr>
+            </w:r>
+          </w:p>
+        </w:tc>
+        <w:tc>
+          <w:tcPr>
+            <w:tcW w:type="dxa" w:w="1464"/>
+          </w:tcPr>
+          <w:p>
+            <w:r/>
+            <w:r>
+              <w:rPr>
+                <w:rFonts w:ascii="Times New Roman" w:hAnsi="Times New Roman" w:cs="Times New Roman"/>
+                <w:b w:val="0"/>
+                <w:sz w:val="24"/>
+              </w:rPr>
+            </w:r>
+          </w:p>
+        </w:tc>
+        <w:tc>
+          <w:tcPr>
+            <w:tcW w:type="dxa" w:w="1464"/>
+          </w:tcPr>
+          <w:p>
+            <w:r/>
+            <w:r>
+              <w:rPr>
+                <w:rFonts w:ascii="Times New Roman" w:hAnsi="Times New Roman" w:cs="Times New Roman"/>
+                <w:b w:val="0"/>
+                <w:sz w:val="24"/>
+              </w:rPr>
+            </w:r>
+          </w:p>
+        </w:tc>
+      </w:tr>
     </w:tbl>
     <w:p>
       <w:pPr>
@@ -3716,7 +3995,7 @@
           <w:color w:val="808080"/>
           <w:sz w:val="24"/>
         </w:rPr>
-        <w:t>[Phụ trách: Lê Thị Mỹ Dung - Phần 1] Liệt kê ít nhất 3 quy trình cốt lõi.</w:t>
+        <w:t>[Phụ trách: Lê Thị Mỹ Dung - Phần 1] Liệt kê ít nhất 3 quy trình cốt lõi vào Bảng 1.3 (cùng 4 thông tin như trên).</w:t>
       </w:r>
     </w:p>
     <w:p>
@@ -3968,6 +4247,285 @@
           </w:p>
         </w:tc>
       </w:tr>
+      <w:tr>
+        <w:tc>
+          <w:tcPr>
+            <w:tcW w:type="dxa" w:w="1464"/>
+          </w:tcPr>
+          <w:p>
+            <w:r/>
+            <w:r>
+              <w:rPr>
+                <w:rFonts w:ascii="Times New Roman" w:hAnsi="Times New Roman" w:cs="Times New Roman"/>
+                <w:b w:val="0"/>
+                <w:sz w:val="24"/>
+              </w:rPr>
+              <w:t>2</w:t>
+            </w:r>
+          </w:p>
+        </w:tc>
+        <w:tc>
+          <w:tcPr>
+            <w:tcW w:type="dxa" w:w="1464"/>
+          </w:tcPr>
+          <w:p>
+            <w:r/>
+            <w:r>
+              <w:rPr>
+                <w:rFonts w:ascii="Times New Roman" w:hAnsi="Times New Roman" w:cs="Times New Roman"/>
+                <w:b w:val="0"/>
+                <w:sz w:val="24"/>
+              </w:rPr>
+            </w:r>
+          </w:p>
+        </w:tc>
+        <w:tc>
+          <w:tcPr>
+            <w:tcW w:type="dxa" w:w="1464"/>
+          </w:tcPr>
+          <w:p>
+            <w:r/>
+            <w:r>
+              <w:rPr>
+                <w:rFonts w:ascii="Times New Roman" w:hAnsi="Times New Roman" w:cs="Times New Roman"/>
+                <w:b w:val="0"/>
+                <w:sz w:val="24"/>
+              </w:rPr>
+            </w:r>
+          </w:p>
+        </w:tc>
+        <w:tc>
+          <w:tcPr>
+            <w:tcW w:type="dxa" w:w="1464"/>
+          </w:tcPr>
+          <w:p>
+            <w:r/>
+            <w:r>
+              <w:rPr>
+                <w:rFonts w:ascii="Times New Roman" w:hAnsi="Times New Roman" w:cs="Times New Roman"/>
+                <w:b w:val="0"/>
+                <w:sz w:val="24"/>
+              </w:rPr>
+            </w:r>
+          </w:p>
+        </w:tc>
+        <w:tc>
+          <w:tcPr>
+            <w:tcW w:type="dxa" w:w="1464"/>
+          </w:tcPr>
+          <w:p>
+            <w:r/>
+            <w:r>
+              <w:rPr>
+                <w:rFonts w:ascii="Times New Roman" w:hAnsi="Times New Roman" w:cs="Times New Roman"/>
+                <w:b w:val="0"/>
+                <w:sz w:val="24"/>
+              </w:rPr>
+            </w:r>
+          </w:p>
+        </w:tc>
+        <w:tc>
+          <w:tcPr>
+            <w:tcW w:type="dxa" w:w="1464"/>
+          </w:tcPr>
+          <w:p>
+            <w:r/>
+            <w:r>
+              <w:rPr>
+                <w:rFonts w:ascii="Times New Roman" w:hAnsi="Times New Roman" w:cs="Times New Roman"/>
+                <w:b w:val="0"/>
+                <w:sz w:val="24"/>
+              </w:rPr>
+            </w:r>
+          </w:p>
+        </w:tc>
+      </w:tr>
+      <w:tr>
+        <w:tc>
+          <w:tcPr>
+            <w:tcW w:type="dxa" w:w="1464"/>
+          </w:tcPr>
+          <w:p>
+            <w:r/>
+            <w:r>
+              <w:rPr>
+                <w:rFonts w:ascii="Times New Roman" w:hAnsi="Times New Roman" w:cs="Times New Roman"/>
+                <w:b w:val="0"/>
+                <w:sz w:val="24"/>
+              </w:rPr>
+              <w:t>3</w:t>
+            </w:r>
+          </w:p>
+        </w:tc>
+        <w:tc>
+          <w:tcPr>
+            <w:tcW w:type="dxa" w:w="1464"/>
+          </w:tcPr>
+          <w:p>
+            <w:r/>
+            <w:r>
+              <w:rPr>
+                <w:rFonts w:ascii="Times New Roman" w:hAnsi="Times New Roman" w:cs="Times New Roman"/>
+                <w:b w:val="0"/>
+                <w:sz w:val="24"/>
+              </w:rPr>
+            </w:r>
+          </w:p>
+        </w:tc>
+        <w:tc>
+          <w:tcPr>
+            <w:tcW w:type="dxa" w:w="1464"/>
+          </w:tcPr>
+          <w:p>
+            <w:r/>
+            <w:r>
+              <w:rPr>
+                <w:rFonts w:ascii="Times New Roman" w:hAnsi="Times New Roman" w:cs="Times New Roman"/>
+                <w:b w:val="0"/>
+                <w:sz w:val="24"/>
+              </w:rPr>
+            </w:r>
+          </w:p>
+        </w:tc>
+        <w:tc>
+          <w:tcPr>
+            <w:tcW w:type="dxa" w:w="1464"/>
+          </w:tcPr>
+          <w:p>
+            <w:r/>
+            <w:r>
+              <w:rPr>
+                <w:rFonts w:ascii="Times New Roman" w:hAnsi="Times New Roman" w:cs="Times New Roman"/>
+                <w:b w:val="0"/>
+                <w:sz w:val="24"/>
+              </w:rPr>
+            </w:r>
+          </w:p>
+        </w:tc>
+        <w:tc>
+          <w:tcPr>
+            <w:tcW w:type="dxa" w:w="1464"/>
+          </w:tcPr>
+          <w:p>
+            <w:r/>
+            <w:r>
+              <w:rPr>
+                <w:rFonts w:ascii="Times New Roman" w:hAnsi="Times New Roman" w:cs="Times New Roman"/>
+                <w:b w:val="0"/>
+                <w:sz w:val="24"/>
+              </w:rPr>
+            </w:r>
+          </w:p>
+        </w:tc>
+        <w:tc>
+          <w:tcPr>
+            <w:tcW w:type="dxa" w:w="1464"/>
+          </w:tcPr>
+          <w:p>
+            <w:r/>
+            <w:r>
+              <w:rPr>
+                <w:rFonts w:ascii="Times New Roman" w:hAnsi="Times New Roman" w:cs="Times New Roman"/>
+                <w:b w:val="0"/>
+                <w:sz w:val="24"/>
+              </w:rPr>
+            </w:r>
+          </w:p>
+        </w:tc>
+      </w:tr>
+      <w:tr>
+        <w:tc>
+          <w:tcPr>
+            <w:tcW w:type="dxa" w:w="1464"/>
+          </w:tcPr>
+          <w:p>
+            <w:r/>
+            <w:r>
+              <w:rPr>
+                <w:rFonts w:ascii="Times New Roman" w:hAnsi="Times New Roman" w:cs="Times New Roman"/>
+                <w:b w:val="0"/>
+                <w:sz w:val="24"/>
+              </w:rPr>
+              <w:t>4</w:t>
+            </w:r>
+          </w:p>
+        </w:tc>
+        <w:tc>
+          <w:tcPr>
+            <w:tcW w:type="dxa" w:w="1464"/>
+          </w:tcPr>
+          <w:p>
+            <w:r/>
+            <w:r>
+              <w:rPr>
+                <w:rFonts w:ascii="Times New Roman" w:hAnsi="Times New Roman" w:cs="Times New Roman"/>
+                <w:b w:val="0"/>
+                <w:sz w:val="24"/>
+              </w:rPr>
+            </w:r>
+          </w:p>
+        </w:tc>
+        <w:tc>
+          <w:tcPr>
+            <w:tcW w:type="dxa" w:w="1464"/>
+          </w:tcPr>
+          <w:p>
+            <w:r/>
+            <w:r>
+              <w:rPr>
+                <w:rFonts w:ascii="Times New Roman" w:hAnsi="Times New Roman" w:cs="Times New Roman"/>
+                <w:b w:val="0"/>
+                <w:sz w:val="24"/>
+              </w:rPr>
+            </w:r>
+          </w:p>
+        </w:tc>
+        <w:tc>
+          <w:tcPr>
+            <w:tcW w:type="dxa" w:w="1464"/>
+          </w:tcPr>
+          <w:p>
+            <w:r/>
+            <w:r>
+              <w:rPr>
+                <w:rFonts w:ascii="Times New Roman" w:hAnsi="Times New Roman" w:cs="Times New Roman"/>
+                <w:b w:val="0"/>
+                <w:sz w:val="24"/>
+              </w:rPr>
+            </w:r>
+          </w:p>
+        </w:tc>
+        <w:tc>
+          <w:tcPr>
+            <w:tcW w:type="dxa" w:w="1464"/>
+          </w:tcPr>
+          <w:p>
+            <w:r/>
+            <w:r>
+              <w:rPr>
+                <w:rFonts w:ascii="Times New Roman" w:hAnsi="Times New Roman" w:cs="Times New Roman"/>
+                <w:b w:val="0"/>
+                <w:sz w:val="24"/>
+              </w:rPr>
+            </w:r>
+          </w:p>
+        </w:tc>
+        <w:tc>
+          <w:tcPr>
+            <w:tcW w:type="dxa" w:w="1464"/>
+          </w:tcPr>
+          <w:p>
+            <w:r/>
+            <w:r>
+              <w:rPr>
+                <w:rFonts w:ascii="Times New Roman" w:hAnsi="Times New Roman" w:cs="Times New Roman"/>
+                <w:b w:val="0"/>
+                <w:sz w:val="24"/>
+              </w:rPr>
+            </w:r>
+          </w:p>
+        </w:tc>
+      </w:tr>
     </w:tbl>
     <w:p>
       <w:pPr>
@@ -3989,7 +4547,7 @@
           <w:color w:val="808080"/>
           <w:sz w:val="24"/>
         </w:rPr>
-        <w:t>[Phụ trách: Lê Thị Mỹ Dung - Phần 1] Liệt kê ít nhất 3 quy trình hỗ trợ.</w:t>
+        <w:t>[Phụ trách: Lê Thị Mỹ Dung - Phần 1] Liệt kê ít nhất 3 quy trình hỗ trợ vào Bảng 1.4 (cùng 4 thông tin như trên). Lưu ý: tổng 3 lớp phải đạt tối thiểu 10 quy trình, nên một lớp cần tới 4 quy trình.</w:t>
       </w:r>
     </w:p>
     <w:p>
@@ -4241,6 +4799,285 @@
           </w:p>
         </w:tc>
       </w:tr>
+      <w:tr>
+        <w:tc>
+          <w:tcPr>
+            <w:tcW w:type="dxa" w:w="1464"/>
+          </w:tcPr>
+          <w:p>
+            <w:r/>
+            <w:r>
+              <w:rPr>
+                <w:rFonts w:ascii="Times New Roman" w:hAnsi="Times New Roman" w:cs="Times New Roman"/>
+                <w:b w:val="0"/>
+                <w:sz w:val="24"/>
+              </w:rPr>
+              <w:t>2</w:t>
+            </w:r>
+          </w:p>
+        </w:tc>
+        <w:tc>
+          <w:tcPr>
+            <w:tcW w:type="dxa" w:w="1464"/>
+          </w:tcPr>
+          <w:p>
+            <w:r/>
+            <w:r>
+              <w:rPr>
+                <w:rFonts w:ascii="Times New Roman" w:hAnsi="Times New Roman" w:cs="Times New Roman"/>
+                <w:b w:val="0"/>
+                <w:sz w:val="24"/>
+              </w:rPr>
+            </w:r>
+          </w:p>
+        </w:tc>
+        <w:tc>
+          <w:tcPr>
+            <w:tcW w:type="dxa" w:w="1464"/>
+          </w:tcPr>
+          <w:p>
+            <w:r/>
+            <w:r>
+              <w:rPr>
+                <w:rFonts w:ascii="Times New Roman" w:hAnsi="Times New Roman" w:cs="Times New Roman"/>
+                <w:b w:val="0"/>
+                <w:sz w:val="24"/>
+              </w:rPr>
+            </w:r>
+          </w:p>
+        </w:tc>
+        <w:tc>
+          <w:tcPr>
+            <w:tcW w:type="dxa" w:w="1464"/>
+          </w:tcPr>
+          <w:p>
+            <w:r/>
+            <w:r>
+              <w:rPr>
+                <w:rFonts w:ascii="Times New Roman" w:hAnsi="Times New Roman" w:cs="Times New Roman"/>
+                <w:b w:val="0"/>
+                <w:sz w:val="24"/>
+              </w:rPr>
+            </w:r>
+          </w:p>
+        </w:tc>
+        <w:tc>
+          <w:tcPr>
+            <w:tcW w:type="dxa" w:w="1464"/>
+          </w:tcPr>
+          <w:p>
+            <w:r/>
+            <w:r>
+              <w:rPr>
+                <w:rFonts w:ascii="Times New Roman" w:hAnsi="Times New Roman" w:cs="Times New Roman"/>
+                <w:b w:val="0"/>
+                <w:sz w:val="24"/>
+              </w:rPr>
+            </w:r>
+          </w:p>
+        </w:tc>
+        <w:tc>
+          <w:tcPr>
+            <w:tcW w:type="dxa" w:w="1464"/>
+          </w:tcPr>
+          <w:p>
+            <w:r/>
+            <w:r>
+              <w:rPr>
+                <w:rFonts w:ascii="Times New Roman" w:hAnsi="Times New Roman" w:cs="Times New Roman"/>
+                <w:b w:val="0"/>
+                <w:sz w:val="24"/>
+              </w:rPr>
+            </w:r>
+          </w:p>
+        </w:tc>
+      </w:tr>
+      <w:tr>
+        <w:tc>
+          <w:tcPr>
+            <w:tcW w:type="dxa" w:w="1464"/>
+          </w:tcPr>
+          <w:p>
+            <w:r/>
+            <w:r>
+              <w:rPr>
+                <w:rFonts w:ascii="Times New Roman" w:hAnsi="Times New Roman" w:cs="Times New Roman"/>
+                <w:b w:val="0"/>
+                <w:sz w:val="24"/>
+              </w:rPr>
+              <w:t>3</w:t>
+            </w:r>
+          </w:p>
+        </w:tc>
+        <w:tc>
+          <w:tcPr>
+            <w:tcW w:type="dxa" w:w="1464"/>
+          </w:tcPr>
+          <w:p>
+            <w:r/>
+            <w:r>
+              <w:rPr>
+                <w:rFonts w:ascii="Times New Roman" w:hAnsi="Times New Roman" w:cs="Times New Roman"/>
+                <w:b w:val="0"/>
+                <w:sz w:val="24"/>
+              </w:rPr>
+            </w:r>
+          </w:p>
+        </w:tc>
+        <w:tc>
+          <w:tcPr>
+            <w:tcW w:type="dxa" w:w="1464"/>
+          </w:tcPr>
+          <w:p>
+            <w:r/>
+            <w:r>
+              <w:rPr>
+                <w:rFonts w:ascii="Times New Roman" w:hAnsi="Times New Roman" w:cs="Times New Roman"/>
+                <w:b w:val="0"/>
+                <w:sz w:val="24"/>
+              </w:rPr>
+            </w:r>
+          </w:p>
+        </w:tc>
+        <w:tc>
+          <w:tcPr>
+            <w:tcW w:type="dxa" w:w="1464"/>
+          </w:tcPr>
+          <w:p>
+            <w:r/>
+            <w:r>
+              <w:rPr>
+                <w:rFonts w:ascii="Times New Roman" w:hAnsi="Times New Roman" w:cs="Times New Roman"/>
+                <w:b w:val="0"/>
+                <w:sz w:val="24"/>
+              </w:rPr>
+            </w:r>
+          </w:p>
+        </w:tc>
+        <w:tc>
+          <w:tcPr>
+            <w:tcW w:type="dxa" w:w="1464"/>
+          </w:tcPr>
+          <w:p>
+            <w:r/>
+            <w:r>
+              <w:rPr>
+                <w:rFonts w:ascii="Times New Roman" w:hAnsi="Times New Roman" w:cs="Times New Roman"/>
+                <w:b w:val="0"/>
+                <w:sz w:val="24"/>
+              </w:rPr>
+            </w:r>
+          </w:p>
+        </w:tc>
+        <w:tc>
+          <w:tcPr>
+            <w:tcW w:type="dxa" w:w="1464"/>
+          </w:tcPr>
+          <w:p>
+            <w:r/>
+            <w:r>
+              <w:rPr>
+                <w:rFonts w:ascii="Times New Roman" w:hAnsi="Times New Roman" w:cs="Times New Roman"/>
+                <w:b w:val="0"/>
+                <w:sz w:val="24"/>
+              </w:rPr>
+            </w:r>
+          </w:p>
+        </w:tc>
+      </w:tr>
+      <w:tr>
+        <w:tc>
+          <w:tcPr>
+            <w:tcW w:type="dxa" w:w="1464"/>
+          </w:tcPr>
+          <w:p>
+            <w:r/>
+            <w:r>
+              <w:rPr>
+                <w:rFonts w:ascii="Times New Roman" w:hAnsi="Times New Roman" w:cs="Times New Roman"/>
+                <w:b w:val="0"/>
+                <w:sz w:val="24"/>
+              </w:rPr>
+              <w:t>4</w:t>
+            </w:r>
+          </w:p>
+        </w:tc>
+        <w:tc>
+          <w:tcPr>
+            <w:tcW w:type="dxa" w:w="1464"/>
+          </w:tcPr>
+          <w:p>
+            <w:r/>
+            <w:r>
+              <w:rPr>
+                <w:rFonts w:ascii="Times New Roman" w:hAnsi="Times New Roman" w:cs="Times New Roman"/>
+                <w:b w:val="0"/>
+                <w:sz w:val="24"/>
+              </w:rPr>
+            </w:r>
+          </w:p>
+        </w:tc>
+        <w:tc>
+          <w:tcPr>
+            <w:tcW w:type="dxa" w:w="1464"/>
+          </w:tcPr>
+          <w:p>
+            <w:r/>
+            <w:r>
+              <w:rPr>
+                <w:rFonts w:ascii="Times New Roman" w:hAnsi="Times New Roman" w:cs="Times New Roman"/>
+                <w:b w:val="0"/>
+                <w:sz w:val="24"/>
+              </w:rPr>
+            </w:r>
+          </w:p>
+        </w:tc>
+        <w:tc>
+          <w:tcPr>
+            <w:tcW w:type="dxa" w:w="1464"/>
+          </w:tcPr>
+          <w:p>
+            <w:r/>
+            <w:r>
+              <w:rPr>
+                <w:rFonts w:ascii="Times New Roman" w:hAnsi="Times New Roman" w:cs="Times New Roman"/>
+                <w:b w:val="0"/>
+                <w:sz w:val="24"/>
+              </w:rPr>
+            </w:r>
+          </w:p>
+        </w:tc>
+        <w:tc>
+          <w:tcPr>
+            <w:tcW w:type="dxa" w:w="1464"/>
+          </w:tcPr>
+          <w:p>
+            <w:r/>
+            <w:r>
+              <w:rPr>
+                <w:rFonts w:ascii="Times New Roman" w:hAnsi="Times New Roman" w:cs="Times New Roman"/>
+                <w:b w:val="0"/>
+                <w:sz w:val="24"/>
+              </w:rPr>
+            </w:r>
+          </w:p>
+        </w:tc>
+        <w:tc>
+          <w:tcPr>
+            <w:tcW w:type="dxa" w:w="1464"/>
+          </w:tcPr>
+          <w:p>
+            <w:r/>
+            <w:r>
+              <w:rPr>
+                <w:rFonts w:ascii="Times New Roman" w:hAnsi="Times New Roman" w:cs="Times New Roman"/>
+                <w:b w:val="0"/>
+                <w:sz w:val="24"/>
+              </w:rPr>
+            </w:r>
+          </w:p>
+        </w:tc>
+      </w:tr>
     </w:tbl>
     <w:p>
       <w:pPr>
@@ -4461,7 +5298,7 @@
           <w:rFonts w:ascii="Times New Roman" w:hAnsi="Times New Roman" w:cs="Times New Roman"/>
           <w:sz w:val="26"/>
         </w:rPr>
-        <w:t>Kế hoạch làm việc</w:t>
+        <w:t>Kế hoạch làm việc (bằng chứng - nếu có)</w:t>
       </w:r>
     </w:p>
     <w:p>
@@ -4472,7 +5309,7 @@
           <w:color w:val="808080"/>
           <w:sz w:val="24"/>
         </w:rPr>
-        <w:t>[Phụ trách: Hoàng Ngọc Long - Phần 3] Chèn sơ đồ Gantt / kế hoạch làm việc của nhóm.</w:t>
+        <w:t>[Phụ trách: Hoàng Ngọc Long - Phần 3] Đây là một loại 'bằng chứng' (phân tích tài liệu) dùng cho khám phá quy trình. Tìm hoặc mô tả một tài liệu kế hoạch làm việc của Highlands Coffee (ví dụ: kế hoạch ca làm việc, kế hoạch kinh doanh tuần/tháng). Đây là bằng chứng của công ty, không phải Gantt của nhóm. Nếu không thu thập được thì bỏ qua (theo ghi chú 'nếu có' trong rubric).</w:t>
       </w:r>
     </w:p>
     <w:p>
@@ -4527,7 +5364,7 @@
           <w:rFonts w:ascii="Times New Roman" w:hAnsi="Times New Roman" w:cs="Times New Roman"/>
           <w:sz w:val="26"/>
         </w:rPr>
-        <w:t xml:space="preserve">: Kế hoạch làm việc của nhóm</w:t>
+        <w:t xml:space="preserve">: Kế hoạch làm việc của Highlands Coffee (bằng chứng, nếu có)</w:t>
       </w:r>
     </w:p>
     <w:p>

</xml_diff>

<commit_message>
docs(báo cáo): bỏ ghi chú giải thích, chỉ giữ cấu trúc heading và bảng
</commit_message>
<xml_diff>
--- a/01_LaVanTien/baocao.docx
+++ b/01_LaVanTien/baocao.docx
@@ -2662,17 +2662,6 @@
       </w:r>
     </w:p>
     <w:p>
-      <w:r>
-        <w:rPr>
-          <w:rFonts w:ascii="Times New Roman" w:hAnsi="Times New Roman" w:cs="Times New Roman"/>
-          <w:i/>
-          <w:color w:val="808080"/>
-          <w:sz w:val="24"/>
-        </w:rPr>
-        <w:t>[Phụ trách: La Văn Tiến - Phần 5] Viết tóm tắt (150-250 từ) sau khi các chương hoàn thiện: giới thiệu Highlands Coffee, mục tiêu, phương pháp, kết quả chính.</w:t>
-      </w:r>
-    </w:p>
-    <w:p>
       <w:pPr>
         <w:spacing w:after="0"/>
         <w:rPr>
@@ -2728,72 +2717,6 @@
       </w:r>
     </w:p>
     <w:p>
-      <w:r>
-        <w:rPr>
-          <w:rFonts w:ascii="Times New Roman" w:hAnsi="Times New Roman" w:cs="Times New Roman"/>
-          <w:i/>
-          <w:color w:val="808080"/>
-          <w:sz w:val="24"/>
-        </w:rPr>
-        <w:t>[Phụ trách: La Văn Tiến - Phần 5] Viết phần Mở đầu gồm các ý:</w:t>
-      </w:r>
-    </w:p>
-    <w:p>
-      <w:r>
-        <w:rPr>
-          <w:rFonts w:ascii="Times New Roman" w:hAnsi="Times New Roman" w:cs="Times New Roman"/>
-          <w:i/>
-          <w:color w:val="808080"/>
-          <w:sz w:val="24"/>
-        </w:rPr>
-        <w:t>1) Lý do chọn đề tài và công ty Highlands Coffee.</w:t>
-      </w:r>
-    </w:p>
-    <w:p>
-      <w:r>
-        <w:rPr>
-          <w:rFonts w:ascii="Times New Roman" w:hAnsi="Times New Roman" w:cs="Times New Roman"/>
-          <w:i/>
-          <w:color w:val="808080"/>
-          <w:sz w:val="24"/>
-        </w:rPr>
-        <w:t>2) Mục tiêu nghiên cứu.</w:t>
-      </w:r>
-    </w:p>
-    <w:p>
-      <w:r>
-        <w:rPr>
-          <w:rFonts w:ascii="Times New Roman" w:hAnsi="Times New Roman" w:cs="Times New Roman"/>
-          <w:i/>
-          <w:color w:val="808080"/>
-          <w:sz w:val="24"/>
-        </w:rPr>
-        <w:t>3) Đối tượng và phạm vi nghiên cứu.</w:t>
-      </w:r>
-    </w:p>
-    <w:p>
-      <w:r>
-        <w:rPr>
-          <w:rFonts w:ascii="Times New Roman" w:hAnsi="Times New Roman" w:cs="Times New Roman"/>
-          <w:i/>
-          <w:color w:val="808080"/>
-          <w:sz w:val="24"/>
-        </w:rPr>
-        <w:t>4) Phương pháp thực hiện.</w:t>
-      </w:r>
-    </w:p>
-    <w:p>
-      <w:r>
-        <w:rPr>
-          <w:rFonts w:ascii="Times New Roman" w:hAnsi="Times New Roman" w:cs="Times New Roman"/>
-          <w:i/>
-          <w:color w:val="808080"/>
-          <w:sz w:val="24"/>
-        </w:rPr>
-        <w:t>5) Cấu trúc báo cáo (gồm 3 chương).</w:t>
-      </w:r>
-    </w:p>
-    <w:p>
       <w:pPr>
         <w:spacing w:after="0"/>
         <w:jc w:val="both"/>
@@ -2930,17 +2853,6 @@
       </w:r>
     </w:p>
     <w:p>
-      <w:r>
-        <w:rPr>
-          <w:rFonts w:ascii="Times New Roman" w:hAnsi="Times New Roman" w:cs="Times New Roman"/>
-          <w:i/>
-          <w:color w:val="808080"/>
-          <w:sz w:val="24"/>
-        </w:rPr>
-        <w:t>[Phụ trách: Lê Thị Mỹ Dung - Phần 1] Giới thiệu ngắn gọn Highlands Coffee: lịch sử hình thành, quy mô, chuỗi cửa hàng, vị thế trong ngành F&amp;B tại Việt Nam (khoảng 1-2 trang).</w:t>
-      </w:r>
-    </w:p>
-    <w:p>
       <w:pPr>
         <w:pStyle w:val="Heading2"/>
       </w:pPr>
@@ -2953,28 +2865,6 @@
       </w:r>
     </w:p>
     <w:p>
-      <w:r>
-        <w:rPr>
-          <w:rFonts w:ascii="Times New Roman" w:hAnsi="Times New Roman" w:cs="Times New Roman"/>
-          <w:i/>
-          <w:color w:val="808080"/>
-          <w:sz w:val="24"/>
-        </w:rPr>
-        <w:t>[Phụ trách: Hoàng Ngọc Long - Phần 3] Chèn sơ đồ tổ chức (org chart) của Highlands Coffee, chỉ ra các phòng ban liên quan đến quy trình nghiệp vụ.</w:t>
-      </w:r>
-    </w:p>
-    <w:p>
-      <w:r>
-        <w:rPr>
-          <w:rFonts w:ascii="Times New Roman" w:hAnsi="Times New Roman" w:cs="Times New Roman"/>
-          <w:i/>
-          <w:color w:val="808080"/>
-          <w:sz w:val="24"/>
-        </w:rPr>
-        <w:t>[Chèn hình/minh hoạ tại đây]</w:t>
-      </w:r>
-    </w:p>
-    <w:p>
       <w:pPr>
         <w:pStyle w:val="Caption"/>
       </w:pPr>
@@ -3028,17 +2918,6 @@
           <w:sz w:val="26"/>
         </w:rPr>
         <w:t>Thuật ngữ và sổ tay nghiệp vụ</w:t>
-      </w:r>
-    </w:p>
-    <w:p>
-      <w:r>
-        <w:rPr>
-          <w:rFonts w:ascii="Times New Roman" w:hAnsi="Times New Roman" w:cs="Times New Roman"/>
-          <w:i/>
-          <w:color w:val="808080"/>
-          <w:sz w:val="24"/>
-        </w:rPr>
-        <w:t>[Phụ trách: Hoàng Ngọc Long - Phần 3] Điền bảng thuật ngữ ngành F&amp;B (≥15 thuật ngữ).</w:t>
       </w:r>
     </w:p>
     <w:p>
@@ -3420,7 +3299,7 @@
           <w:rFonts w:ascii="Times New Roman" w:hAnsi="Times New Roman" w:cs="Times New Roman"/>
           <w:sz w:val="26"/>
         </w:rPr>
-        <w:t>Các quy trình nghiệp vụ của Highlands Coffee được phân thành ba lớp: quy trình quản lý (Management), quy trình cốt lõi (Core) và quy trình hỗ trợ (Support). Cần liệt kê tối thiểu 10 quy trình: mỗi lớp từ 3 quy trình trở lên (3+3+3 = 9), nên một lớp phải có ít nhất 4 quy trình để đạt mốc 10. Mỗi quy trình phải nêu đủ 4 thông tin: Tác nhân (Actor), mô tả các bước bằng lời, đối tượng khách hàng, các khả năng kết quả.</w:t>
+        <w:t>Các quy trình nghiệp vụ của Highlands Coffee được phân thành ba lớp: quy trình quản lý (Management), quy trình cốt lõi (Core) và quy trình hỗ trợ (Support).</w:t>
       </w:r>
     </w:p>
     <w:p>
@@ -3433,17 +3312,6 @@
           <w:sz w:val="26"/>
         </w:rPr>
         <w:t>Quy trình quản lý (Management)</w:t>
-      </w:r>
-    </w:p>
-    <w:p>
-      <w:r>
-        <w:rPr>
-          <w:rFonts w:ascii="Times New Roman" w:hAnsi="Times New Roman" w:cs="Times New Roman"/>
-          <w:i/>
-          <w:color w:val="808080"/>
-          <w:sz w:val="24"/>
-        </w:rPr>
-        <w:t>[Phụ trách: Lê Thị Mỹ Dung - Phần 1] Liệt kê ít nhất 3 quy trình quản lý vào Bảng 1.2. Mỗi quy trình nêu đủ 4 thông tin: Tác nhân (Actor), mô tả các bước, đối tượng khách hàng, các khả năng kết quả.</w:t>
       </w:r>
     </w:p>
     <w:p>
@@ -3988,17 +3856,6 @@
       </w:r>
     </w:p>
     <w:p>
-      <w:r>
-        <w:rPr>
-          <w:rFonts w:ascii="Times New Roman" w:hAnsi="Times New Roman" w:cs="Times New Roman"/>
-          <w:i/>
-          <w:color w:val="808080"/>
-          <w:sz w:val="24"/>
-        </w:rPr>
-        <w:t>[Phụ trách: Lê Thị Mỹ Dung - Phần 1] Liệt kê ít nhất 3 quy trình cốt lõi vào Bảng 1.3 (cùng 4 thông tin như trên).</w:t>
-      </w:r>
-    </w:p>
-    <w:p>
       <w:pPr>
         <w:pStyle w:val="Caption"/>
       </w:pPr>
@@ -4540,17 +4397,6 @@
       </w:r>
     </w:p>
     <w:p>
-      <w:r>
-        <w:rPr>
-          <w:rFonts w:ascii="Times New Roman" w:hAnsi="Times New Roman" w:cs="Times New Roman"/>
-          <w:i/>
-          <w:color w:val="808080"/>
-          <w:sz w:val="24"/>
-        </w:rPr>
-        <w:t>[Phụ trách: Lê Thị Mỹ Dung - Phần 1] Liệt kê ít nhất 3 quy trình hỗ trợ vào Bảng 1.4 (cùng 4 thông tin như trên). Lưu ý: tổng 3 lớp phải đạt tối thiểu 10 quy trình, nên một lớp cần tới 4 quy trình.</w:t>
-      </w:r>
-    </w:p>
-    <w:p>
       <w:pPr>
         <w:pStyle w:val="Caption"/>
       </w:pPr>
@@ -5092,28 +4938,6 @@
       </w:r>
     </w:p>
     <w:p>
-      <w:r>
-        <w:rPr>
-          <w:rFonts w:ascii="Times New Roman" w:hAnsi="Times New Roman" w:cs="Times New Roman"/>
-          <w:i/>
-          <w:color w:val="808080"/>
-          <w:sz w:val="24"/>
-        </w:rPr>
-        <w:t>[Phụ trách: Lê Thị Mỹ Dung - Phần 1] Vẽ sơ đồ kiến trúc quy trình (process architecture) thể hiện 10 quy trình và quan hệ giữa chúng.</w:t>
-      </w:r>
-    </w:p>
-    <w:p>
-      <w:r>
-        <w:rPr>
-          <w:rFonts w:ascii="Times New Roman" w:hAnsi="Times New Roman" w:cs="Times New Roman"/>
-          <w:i/>
-          <w:color w:val="808080"/>
-          <w:sz w:val="24"/>
-        </w:rPr>
-        <w:t>[Chèn hình/minh hoạ tại đây]</w:t>
-      </w:r>
-    </w:p>
-    <w:p>
       <w:pPr>
         <w:pStyle w:val="Caption"/>
       </w:pPr>
@@ -5212,17 +5036,6 @@
       </w:r>
     </w:p>
     <w:p>
-      <w:r>
-        <w:rPr>
-          <w:rFonts w:ascii="Times New Roman" w:hAnsi="Times New Roman" w:cs="Times New Roman"/>
-          <w:i/>
-          <w:color w:val="808080"/>
-          <w:sz w:val="24"/>
-        </w:rPr>
-        <w:t>[Phụ trách: Hoàng Ngọc Long - Phần 3] Mô tả tổng quan các quy trình hiện có của Highlands Coffee dựa trên tài liệu và quan sát (1-2 trang).</w:t>
-      </w:r>
-    </w:p>
-    <w:p>
       <w:pPr>
         <w:pStyle w:val="Heading3"/>
       </w:pPr>
@@ -5235,17 +5048,6 @@
       </w:r>
     </w:p>
     <w:p>
-      <w:r>
-        <w:rPr>
-          <w:rFonts w:ascii="Times New Roman" w:hAnsi="Times New Roman" w:cs="Times New Roman"/>
-          <w:i/>
-          <w:color w:val="808080"/>
-          <w:sz w:val="24"/>
-        </w:rPr>
-        <w:t>[Phụ trách: Hoàng Ngọc Long - Phần 3] Thiết kế biểu mẫu quan sát/workshop và kịch bản phỏng vấn nhanh.</w:t>
-      </w:r>
-    </w:p>
-    <w:p>
       <w:pPr>
         <w:pStyle w:val="Caption"/>
       </w:pPr>
@@ -5302,28 +5104,6 @@
       </w:r>
     </w:p>
     <w:p>
-      <w:r>
-        <w:rPr>
-          <w:rFonts w:ascii="Times New Roman" w:hAnsi="Times New Roman" w:cs="Times New Roman"/>
-          <w:i/>
-          <w:color w:val="808080"/>
-          <w:sz w:val="24"/>
-        </w:rPr>
-        <w:t>[Phụ trách: Hoàng Ngọc Long - Phần 3] Đây là một loại 'bằng chứng' (phân tích tài liệu) dùng cho khám phá quy trình. Tìm hoặc mô tả một tài liệu kế hoạch làm việc của Highlands Coffee (ví dụ: kế hoạch ca làm việc, kế hoạch kinh doanh tuần/tháng). Đây là bằng chứng của công ty, không phải Gantt của nhóm. Nếu không thu thập được thì bỏ qua (theo ghi chú 'nếu có' trong rubric).</w:t>
-      </w:r>
-    </w:p>
-    <w:p>
-      <w:r>
-        <w:rPr>
-          <w:rFonts w:ascii="Times New Roman" w:hAnsi="Times New Roman" w:cs="Times New Roman"/>
-          <w:i/>
-          <w:color w:val="808080"/>
-          <w:sz w:val="24"/>
-        </w:rPr>
-        <w:t>[Chèn hình/minh hoạ tại đây]</w:t>
-      </w:r>
-    </w:p>
-    <w:p>
       <w:pPr>
         <w:pStyle w:val="Caption"/>
       </w:pPr>
@@ -5389,17 +5169,6 @@
           <w:sz w:val="26"/>
         </w:rPr>
         <w:t>Phân loại câu hỏi</w:t>
-      </w:r>
-    </w:p>
-    <w:p>
-      <w:r>
-        <w:rPr>
-          <w:rFonts w:ascii="Times New Roman" w:hAnsi="Times New Roman" w:cs="Times New Roman"/>
-          <w:i/>
-          <w:color w:val="808080"/>
-          <w:sz w:val="24"/>
-        </w:rPr>
-        <w:t>[Phụ trách: Hoàng Ngọc Long - Phần 3] Ma trận 2×2 phân loại 20 câu hỏi theo Định tính/Định lượng và Cấu trúc/Không cấu trúc.</w:t>
       </w:r>
     </w:p>
     <w:p>
@@ -5618,17 +5387,6 @@
           <w:sz w:val="26"/>
         </w:rPr>
         <w:t>Bộ 20 câu hỏi phỏng vấn</w:t>
-      </w:r>
-    </w:p>
-    <w:p>
-      <w:r>
-        <w:rPr>
-          <w:rFonts w:ascii="Times New Roman" w:hAnsi="Times New Roman" w:cs="Times New Roman"/>
-          <w:i/>
-          <w:color w:val="808080"/>
-          <w:sz w:val="24"/>
-        </w:rPr>
-        <w:t>[Phụ trách: Hoàng Ngọc Long - Phần 3] Điền nội dung 20 câu hỏi (≥20 câu để đạt 0.5đ; 10-20 câu = 0.25đ; &lt;10 = 0đ).</w:t>
       </w:r>
     </w:p>
     <w:p>
@@ -7072,7 +6830,7 @@
           <w:rFonts w:ascii="Times New Roman" w:hAnsi="Times New Roman" w:cs="Times New Roman"/>
           <w:sz w:val="26"/>
         </w:rPr>
-        <w:t>Phần này trình bày 6 sơ đồ BPMN cho 6 quy trình đại diện (2 quy trình quản lý, 2 quy trình cốt lõi, 2 quy trình hỗ trợ). Mỗi sơ đồ phải có cổng điều kiện (gateway), điểm rẽ nhánh (Split) và điểm hội (Join), sử dụng đúng ký hiệu BPMN 2.0.</w:t>
+        <w:t>Phần này trình bày mô hình BPMN cho các quy trình đại diện của Highlands Coffee.</w:t>
       </w:r>
     </w:p>
     <w:p>
@@ -7088,28 +6846,6 @@
       </w:r>
     </w:p>
     <w:p>
-      <w:r>
-        <w:rPr>
-          <w:rFonts w:ascii="Times New Roman" w:hAnsi="Times New Roman" w:cs="Times New Roman"/>
-          <w:i/>
-          <w:color w:val="808080"/>
-          <w:sz w:val="24"/>
-        </w:rPr>
-        <w:t>[Phụ trách: Nguyễn Duy Nhiệm - Phần 2] Vẽ 2 sơ đồ BPMN cho 2 quy trình quản lý, mỗi sơ đồ độ phức tạp &gt;7 (tổng số phần tử ≥8).</w:t>
-      </w:r>
-    </w:p>
-    <w:p>
-      <w:r>
-        <w:rPr>
-          <w:rFonts w:ascii="Times New Roman" w:hAnsi="Times New Roman" w:cs="Times New Roman"/>
-          <w:i/>
-          <w:color w:val="808080"/>
-          <w:sz w:val="24"/>
-        </w:rPr>
-        <w:t>[Chèn hình/minh hoạ tại đây]</w:t>
-      </w:r>
-    </w:p>
-    <w:p>
       <w:pPr>
         <w:pStyle w:val="Caption"/>
       </w:pPr>
@@ -7154,17 +6890,6 @@
       </w:r>
     </w:p>
     <w:p>
-      <w:r>
-        <w:rPr>
-          <w:rFonts w:ascii="Times New Roman" w:hAnsi="Times New Roman" w:cs="Times New Roman"/>
-          <w:i/>
-          <w:color w:val="808080"/>
-          <w:sz w:val="24"/>
-        </w:rPr>
-        <w:t>[Chèn hình/minh hoạ tại đây]</w:t>
-      </w:r>
-    </w:p>
-    <w:p>
       <w:pPr>
         <w:pStyle w:val="Caption"/>
       </w:pPr>
@@ -7221,28 +6946,6 @@
       </w:r>
     </w:p>
     <w:p>
-      <w:r>
-        <w:rPr>
-          <w:rFonts w:ascii="Times New Roman" w:hAnsi="Times New Roman" w:cs="Times New Roman"/>
-          <w:i/>
-          <w:color w:val="808080"/>
-          <w:sz w:val="24"/>
-        </w:rPr>
-        <w:t>[Phụ trách: Nguyễn Duy Nhiệm - Phần 2] Vẽ 2 sơ đồ BPMN cho 2 quy trình cốt lõi, mỗi sơ đồ độ phức tạp &gt;5 (≥6).</w:t>
-      </w:r>
-    </w:p>
-    <w:p>
-      <w:r>
-        <w:rPr>
-          <w:rFonts w:ascii="Times New Roman" w:hAnsi="Times New Roman" w:cs="Times New Roman"/>
-          <w:i/>
-          <w:color w:val="808080"/>
-          <w:sz w:val="24"/>
-        </w:rPr>
-        <w:t>[Chèn hình/minh hoạ tại đây]</w:t>
-      </w:r>
-    </w:p>
-    <w:p>
       <w:pPr>
         <w:pStyle w:val="Caption"/>
       </w:pPr>
@@ -7287,17 +6990,6 @@
       </w:r>
     </w:p>
     <w:p>
-      <w:r>
-        <w:rPr>
-          <w:rFonts w:ascii="Times New Roman" w:hAnsi="Times New Roman" w:cs="Times New Roman"/>
-          <w:i/>
-          <w:color w:val="808080"/>
-          <w:sz w:val="24"/>
-        </w:rPr>
-        <w:t>[Chèn hình/minh hoạ tại đây]</w:t>
-      </w:r>
-    </w:p>
-    <w:p>
       <w:pPr>
         <w:pStyle w:val="Caption"/>
       </w:pPr>
@@ -7354,28 +7046,6 @@
       </w:r>
     </w:p>
     <w:p>
-      <w:r>
-        <w:rPr>
-          <w:rFonts w:ascii="Times New Roman" w:hAnsi="Times New Roman" w:cs="Times New Roman"/>
-          <w:i/>
-          <w:color w:val="808080"/>
-          <w:sz w:val="24"/>
-        </w:rPr>
-        <w:t>[Phụ trách: Nguyễn Duy Nhiệm - Phần 2] Vẽ 2 sơ đồ BPMN cho 2 quy trình hỗ trợ, mỗi sơ đồ độ phức tạp &gt;3 (≥4).</w:t>
-      </w:r>
-    </w:p>
-    <w:p>
-      <w:r>
-        <w:rPr>
-          <w:rFonts w:ascii="Times New Roman" w:hAnsi="Times New Roman" w:cs="Times New Roman"/>
-          <w:i/>
-          <w:color w:val="808080"/>
-          <w:sz w:val="24"/>
-        </w:rPr>
-        <w:t>[Chèn hình/minh hoạ tại đây]</w:t>
-      </w:r>
-    </w:p>
-    <w:p>
       <w:pPr>
         <w:pStyle w:val="Caption"/>
       </w:pPr>
@@ -7417,17 +7087,6 @@
           <w:sz w:val="26"/>
         </w:rPr>
         <w:t xml:space="preserve">: BPMN quy trình hỗ trợ 1</w:t>
-      </w:r>
-    </w:p>
-    <w:p>
-      <w:r>
-        <w:rPr>
-          <w:rFonts w:ascii="Times New Roman" w:hAnsi="Times New Roman" w:cs="Times New Roman"/>
-          <w:i/>
-          <w:color w:val="808080"/>
-          <w:sz w:val="24"/>
-        </w:rPr>
-        <w:t>[Chèn hình/minh hoạ tại đây]</w:t>
       </w:r>
     </w:p>
     <w:p>
@@ -7533,17 +7192,6 @@
           <w:sz w:val="26"/>
         </w:rPr>
         <w:t>Phân tích giá trị gia tăng (VA/VBA/NVA)</w:t>
-      </w:r>
-    </w:p>
-    <w:p>
-      <w:r>
-        <w:rPr>
-          <w:rFonts w:ascii="Times New Roman" w:hAnsi="Times New Roman" w:cs="Times New Roman"/>
-          <w:i/>
-          <w:color w:val="808080"/>
-          <w:sz w:val="24"/>
-        </w:rPr>
-        <w:t>[Phụ trách: Bùi Quang Vinh - Phần 4] Lập bảng phân tích giá trị gia tăng cho 2 quy trình: đánh giá từng bước là VA, VBA hay NVA.</w:t>
       </w:r>
     </w:p>
     <w:p>
@@ -7929,17 +7577,6 @@
       </w:r>
     </w:p>
     <w:p>
-      <w:r>
-        <w:rPr>
-          <w:rFonts w:ascii="Times New Roman" w:hAnsi="Times New Roman" w:cs="Times New Roman"/>
-          <w:i/>
-          <w:color w:val="808080"/>
-          <w:sz w:val="24"/>
-        </w:rPr>
-        <w:t>[Phụ trách: Bùi Quang Vinh - Phần 4] Lập bảng phân tích lãng phí cho 2 quy trình theo Move/Hold/Overdo.</w:t>
-      </w:r>
-    </w:p>
-    <w:p>
       <w:pPr>
         <w:pStyle w:val="Caption"/>
       </w:pPr>
@@ -8322,28 +7959,6 @@
       </w:r>
     </w:p>
     <w:p>
-      <w:r>
-        <w:rPr>
-          <w:rFonts w:ascii="Times New Roman" w:hAnsi="Times New Roman" w:cs="Times New Roman"/>
-          <w:i/>
-          <w:color w:val="808080"/>
-          <w:sz w:val="24"/>
-        </w:rPr>
-        <w:t>[Phụ trách: Bùi Quang Vinh - Phần 4] Chọn MỘT trong ba phương pháp để phân tích: biểu đồ Pareto, phân tích nguyên nhân-kết quả (Root-cause) hoặc biểu đồ xương cá (Fishbone).</w:t>
-      </w:r>
-    </w:p>
-    <w:p>
-      <w:r>
-        <w:rPr>
-          <w:rFonts w:ascii="Times New Roman" w:hAnsi="Times New Roman" w:cs="Times New Roman"/>
-          <w:i/>
-          <w:color w:val="808080"/>
-          <w:sz w:val="24"/>
-        </w:rPr>
-        <w:t>[Chèn hình/minh hoạ tại đây]</w:t>
-      </w:r>
-    </w:p>
-    <w:p>
       <w:pPr>
         <w:pStyle w:val="Caption"/>
       </w:pPr>
@@ -8409,17 +8024,6 @@
           <w:sz w:val="26"/>
         </w:rPr>
         <w:t>Phân tích thời gian</w:t>
-      </w:r>
-    </w:p>
-    <w:p>
-      <w:r>
-        <w:rPr>
-          <w:rFonts w:ascii="Times New Roman" w:hAnsi="Times New Roman" w:cs="Times New Roman"/>
-          <w:i/>
-          <w:color w:val="808080"/>
-          <w:sz w:val="24"/>
-        </w:rPr>
-        <w:t>[Phụ trách: Bùi Quang Vinh - Phần 4] Tính toán các chỉ số thời gian (cycle time, lead time, processing time, waiting time) cho 2 quy trình, kèm công thức.</w:t>
       </w:r>
     </w:p>
     <w:p>
@@ -8620,17 +8224,6 @@
       </w:r>
     </w:p>
     <w:p>
-      <w:r>
-        <w:rPr>
-          <w:rFonts w:ascii="Times New Roman" w:hAnsi="Times New Roman" w:cs="Times New Roman"/>
-          <w:i/>
-          <w:color w:val="808080"/>
-          <w:sz w:val="24"/>
-        </w:rPr>
-        <w:t>[Phụ trách: Bùi Quang Vinh - Phần 4] Tính các chỉ số chất lượng (tỷ lệ lỗi, first-time-right, số phàn nàn...) cho 2 quy trình, kèm công thức.</w:t>
-      </w:r>
-    </w:p>
-    <w:p>
       <w:pPr>
         <w:pStyle w:val="Caption"/>
       </w:pPr>
@@ -8825,17 +8418,6 @@
           <w:sz w:val="26"/>
         </w:rPr>
         <w:t>Phân tích chi phí</w:t>
-      </w:r>
-    </w:p>
-    <w:p>
-      <w:r>
-        <w:rPr>
-          <w:rFonts w:ascii="Times New Roman" w:hAnsi="Times New Roman" w:cs="Times New Roman"/>
-          <w:i/>
-          <w:color w:val="808080"/>
-          <w:sz w:val="24"/>
-        </w:rPr>
-        <w:t>[Phụ trách: Bùi Quang Vinh - Phần 4] Tính chi phí (labour cost, cost of poor quality, resource cost) cho 2 quy trình, kèm công thức.</w:t>
       </w:r>
     </w:p>
     <w:p>

</xml_diff>